<commit_message>
docs(uml): add v2.4 entities (SeedMatrixEntry/per-AZ CRG/ReservationEligibility)
</commit_message>
<xml_diff>
--- a/docs/design/acrme_uml_class_diagrams_summary.docx
+++ b/docs/design/acrme_uml_class_diagrams_summary.docx
@@ -199,6 +199,533 @@
       </w:r>
       <w:r>
         <w:t xml:space="preserve">).</w:t>
+      </w:r>
+    </w:p>
+    <w:p>
+      <w:pPr>
+        <w:pStyle w:val="BlockText"/>
+      </w:pPr>
+      <w:r>
+        <w:rPr>
+          <w:bCs/>
+          <w:b/>
+        </w:rPr>
+        <w:t xml:space="preserve">v2.4 reconciliation note (7 Sep 2026).</w:t>
+      </w:r>
+      <w:r>
+        <w:t xml:space="preserve"> </w:t>
+      </w:r>
+      <w:r>
+        <w:t xml:space="preserve">This summary is further reconciled to Requirements Baseline</w:t>
+      </w:r>
+      <w:r>
+        <w:t xml:space="preserve"> </w:t>
+      </w:r>
+      <w:r>
+        <w:rPr>
+          <w:bCs/>
+          <w:b/>
+        </w:rPr>
+        <w:t xml:space="preserve">v2.4</w:t>
+      </w:r>
+      <w:r>
+        <w:t xml:space="preserve"> </w:t>
+      </w:r>
+      <w:r>
+        <w:t xml:space="preserve">and the core domain model (</w:t>
+      </w:r>
+      <w:r>
+        <w:rPr>
+          <w:rStyle w:val="VerbatimChar"/>
+        </w:rPr>
+        <w:t xml:space="preserve">uml_01_core_domain_model.md</w:t>
+      </w:r>
+      <w:r>
+        <w:t xml:space="preserve">). No entity is removed; the following v2.4 additions are folded into Diagram 1: (a)</w:t>
+      </w:r>
+      <w:r>
+        <w:t xml:space="preserve"> </w:t>
+      </w:r>
+      <w:r>
+        <w:rPr>
+          <w:bCs/>
+          <w:b/>
+        </w:rPr>
+        <w:t xml:space="preserve">per-AZ + regional CRG structure</w:t>
+      </w:r>
+      <w:r>
+        <w:t xml:space="preserve"> </w:t>
+      </w:r>
+      <w:r>
+        <w:t xml:space="preserve">— the earlier</w:t>
+      </w:r>
+      <w:r>
+        <w:t xml:space="preserve"> </w:t>
+      </w:r>
+      <w:r>
+        <w:t xml:space="preserve">“</w:t>
+      </w:r>
+      <w:r>
+        <w:t xml:space="preserve">three-CRG (Prod/NonProd/DR) per region</w:t>
+      </w:r>
+      <w:r>
+        <w:t xml:space="preserve">”</w:t>
+      </w:r>
+      <w:r>
+        <w:t xml:space="preserve"> </w:t>
+      </w:r>
+      <w:r>
+        <w:t xml:space="preserve">model is extended by</w:t>
+      </w:r>
+      <w:r>
+        <w:t xml:space="preserve"> </w:t>
+      </w:r>
+      <w:r>
+        <w:rPr>
+          <w:bCs/>
+          <w:b/>
+        </w:rPr>
+        <w:t xml:space="preserve">CAP-023</w:t>
+      </w:r>
+      <w:r>
+        <w:t xml:space="preserve"> </w:t>
+      </w:r>
+      <w:r>
+        <w:t xml:space="preserve">so each environment carries one</w:t>
+      </w:r>
+      <w:r>
+        <w:t xml:space="preserve"> </w:t>
+      </w:r>
+      <w:r>
+        <w:rPr>
+          <w:bCs/>
+          <w:b/>
+        </w:rPr>
+        <w:t xml:space="preserve">regional</w:t>
+      </w:r>
+      <w:r>
+        <w:t xml:space="preserve"> </w:t>
+      </w:r>
+      <w:r>
+        <w:t xml:space="preserve">CRG (</w:t>
+      </w:r>
+      <w:r>
+        <w:rPr>
+          <w:rStyle w:val="VerbatimChar"/>
+        </w:rPr>
+        <w:t xml:space="preserve">crg-&lt;env&gt;-&lt;region&gt;-reg</w:t>
+      </w:r>
+      <w:r>
+        <w:t xml:space="preserve">) plus one CRG</w:t>
+      </w:r>
+      <w:r>
+        <w:t xml:space="preserve"> </w:t>
+      </w:r>
+      <w:r>
+        <w:rPr>
+          <w:bCs/>
+          <w:b/>
+        </w:rPr>
+        <w:t xml:space="preserve">per AZ</w:t>
+      </w:r>
+      <w:r>
+        <w:t xml:space="preserve"> </w:t>
+      </w:r>
+      <w:r>
+        <w:t xml:space="preserve">(</w:t>
+      </w:r>
+      <w:r>
+        <w:rPr>
+          <w:rStyle w:val="VerbatimChar"/>
+        </w:rPr>
+        <w:t xml:space="preserve">az1/az2/az3</w:t>
+      </w:r>
+      <w:r>
+        <w:t xml:space="preserve">);</w:t>
+      </w:r>
+      <w:r>
+        <w:t xml:space="preserve"> </w:t>
+      </w:r>
+      <w:r>
+        <w:rPr>
+          <w:rStyle w:val="VerbatimChar"/>
+        </w:rPr>
+        <w:t xml:space="preserve">CapacityReservationGroup</w:t>
+      </w:r>
+      <w:r>
+        <w:t xml:space="preserve"> </w:t>
+      </w:r>
+      <w:r>
+        <w:t xml:space="preserve">gains</w:t>
+      </w:r>
+      <w:r>
+        <w:t xml:space="preserve"> </w:t>
+      </w:r>
+      <w:r>
+        <w:rPr>
+          <w:rStyle w:val="VerbatimChar"/>
+        </w:rPr>
+        <w:t xml:space="preserve">environment</w:t>
+      </w:r>
+      <w:r>
+        <w:t xml:space="preserve"> </w:t>
+      </w:r>
+      <w:r>
+        <w:t xml:space="preserve">and</w:t>
+      </w:r>
+      <w:r>
+        <w:t xml:space="preserve"> </w:t>
+      </w:r>
+      <w:r>
+        <w:rPr>
+          <w:rStyle w:val="VerbatimChar"/>
+        </w:rPr>
+        <w:t xml:space="preserve">crgScope</w:t>
+      </w:r>
+      <w:r>
+        <w:t xml:space="preserve"> </w:t>
+      </w:r>
+      <w:r>
+        <w:t xml:space="preserve">(</w:t>
+      </w:r>
+      <w:r>
+        <w:rPr>
+          <w:rStyle w:val="VerbatimChar"/>
+        </w:rPr>
+        <w:t xml:space="preserve">REGIONAL | ZONAL</w:t>
+      </w:r>
+      <w:r>
+        <w:t xml:space="preserve">) and an</w:t>
+      </w:r>
+      <w:r>
+        <w:t xml:space="preserve"> </w:t>
+      </w:r>
+      <w:r>
+        <w:rPr>
+          <w:rStyle w:val="VerbatimChar"/>
+        </w:rPr>
+        <w:t xml:space="preserve">isZonal()</w:t>
+      </w:r>
+      <w:r>
+        <w:t xml:space="preserve"> </w:t>
+      </w:r>
+      <w:r>
+        <w:t xml:space="preserve">accessor; (b)</w:t>
+      </w:r>
+      <w:r>
+        <w:t xml:space="preserve"> </w:t>
+      </w:r>
+      <w:r>
+        <w:rPr>
+          <w:bCs/>
+          <w:b/>
+        </w:rPr>
+        <w:t xml:space="preserve">seed-at-0 governance</w:t>
+      </w:r>
+      <w:r>
+        <w:t xml:space="preserve"> </w:t>
+      </w:r>
+      <w:r>
+        <w:t xml:space="preserve">— new entity</w:t>
+      </w:r>
+      <w:r>
+        <w:t xml:space="preserve"> </w:t>
+      </w:r>
+      <w:r>
+        <w:rPr>
+          <w:rStyle w:val="VerbatimChar"/>
+        </w:rPr>
+        <w:t xml:space="preserve">SeedMatrixEntry</w:t>
+      </w:r>
+      <w:r>
+        <w:t xml:space="preserve"> </w:t>
+      </w:r>
+      <w:r>
+        <w:t xml:space="preserve">(</w:t>
+      </w:r>
+      <w:r>
+        <w:rPr>
+          <w:bCs/>
+          <w:b/>
+        </w:rPr>
+        <w:t xml:space="preserve">CAP-022</w:t>
+      </w:r>
+      <w:r>
+        <w:t xml:space="preserve">, extends CAP-009) records the product-team-governed seed matrix initialised at 0, and</w:t>
+      </w:r>
+      <w:r>
+        <w:t xml:space="preserve"> </w:t>
+      </w:r>
+      <w:r>
+        <w:rPr>
+          <w:rStyle w:val="VerbatimChar"/>
+        </w:rPr>
+        <w:t xml:space="preserve">CapacityReservation</w:t>
+      </w:r>
+      <w:r>
+        <w:t xml:space="preserve"> </w:t>
+      </w:r>
+      <w:r>
+        <w:t xml:space="preserve">gains</w:t>
+      </w:r>
+      <w:r>
+        <w:t xml:space="preserve"> </w:t>
+      </w:r>
+      <w:r>
+        <w:rPr>
+          <w:rStyle w:val="VerbatimChar"/>
+        </w:rPr>
+        <w:t xml:space="preserve">reservationType</w:t>
+      </w:r>
+      <w:r>
+        <w:t xml:space="preserve"> </w:t>
+      </w:r>
+      <w:r>
+        <w:t xml:space="preserve">(</w:t>
+      </w:r>
+      <w:r>
+        <w:rPr>
+          <w:rStyle w:val="VerbatimChar"/>
+        </w:rPr>
+        <w:t xml:space="preserve">SEED | ACTIVE</w:t>
+      </w:r>
+      <w:r>
+        <w:t xml:space="preserve">) with</w:t>
+      </w:r>
+      <w:r>
+        <w:t xml:space="preserve"> </w:t>
+      </w:r>
+      <w:r>
+        <w:rPr>
+          <w:rStyle w:val="VerbatimChar"/>
+        </w:rPr>
+        <w:t xml:space="preserve">isSeed()</w:t>
+      </w:r>
+      <w:r>
+        <w:t xml:space="preserve">; (c)</w:t>
+      </w:r>
+      <w:r>
+        <w:t xml:space="preserve"> </w:t>
+      </w:r>
+      <w:r>
+        <w:rPr>
+          <w:bCs/>
+          <w:b/>
+        </w:rPr>
+        <w:t xml:space="preserve">reservation eligibility</w:t>
+      </w:r>
+      <w:r>
+        <w:t xml:space="preserve"> </w:t>
+      </w:r>
+      <w:r>
+        <w:t xml:space="preserve">— new entity</w:t>
+      </w:r>
+      <w:r>
+        <w:t xml:space="preserve"> </w:t>
+      </w:r>
+      <w:r>
+        <w:rPr>
+          <w:rStyle w:val="VerbatimChar"/>
+        </w:rPr>
+        <w:t xml:space="preserve">ReservationEligibility</w:t>
+      </w:r>
+      <w:r>
+        <w:t xml:space="preserve"> </w:t>
+      </w:r>
+      <w:r>
+        <w:t xml:space="preserve">(</w:t>
+      </w:r>
+      <w:r>
+        <w:rPr>
+          <w:bCs/>
+          <w:b/>
+        </w:rPr>
+        <w:t xml:space="preserve">CAP-020/CAP-021</w:t>
+      </w:r>
+      <w:r>
+        <w:t xml:space="preserve">) captures Availability-Set-VM ineligibility (CAP-020) and the deallocate/redeploy-to-AZ onboarding precondition (CAP-021), and</w:t>
+      </w:r>
+      <w:r>
+        <w:t xml:space="preserve"> </w:t>
+      </w:r>
+      <w:r>
+        <w:rPr>
+          <w:rStyle w:val="VerbatimChar"/>
+        </w:rPr>
+        <w:t xml:space="preserve">CapacityReservation</w:t>
+      </w:r>
+      <w:r>
+        <w:t xml:space="preserve"> </w:t>
+      </w:r>
+      <w:r>
+        <w:t xml:space="preserve">gains</w:t>
+      </w:r>
+      <w:r>
+        <w:t xml:space="preserve"> </w:t>
+      </w:r>
+      <w:r>
+        <w:rPr>
+          <w:rStyle w:val="VerbatimChar"/>
+        </w:rPr>
+        <w:t xml:space="preserve">placementType</w:t>
+      </w:r>
+      <w:r>
+        <w:t xml:space="preserve">; (d)</w:t>
+      </w:r>
+      <w:r>
+        <w:t xml:space="preserve"> </w:t>
+      </w:r>
+      <w:r>
+        <w:rPr>
+          <w:bCs/>
+          <w:b/>
+        </w:rPr>
+        <w:t xml:space="preserve">reactive discovery</w:t>
+      </w:r>
+      <w:r>
+        <w:t xml:space="preserve"> </w:t>
+      </w:r>
+      <w:r>
+        <w:t xml:space="preserve">—</w:t>
+      </w:r>
+      <w:r>
+        <w:t xml:space="preserve"> </w:t>
+      </w:r>
+      <w:r>
+        <w:rPr>
+          <w:bCs/>
+          <w:b/>
+        </w:rPr>
+        <w:t xml:space="preserve">CAP-024</w:t>
+      </w:r>
+      <w:r>
+        <w:t xml:space="preserve"> </w:t>
+      </w:r>
+      <w:r>
+        <w:t xml:space="preserve">auto-creates missing SKU/AZ reservations against the seed matrix and raises a scope-file governance item (reconciles CAP-019); (e)</w:t>
+      </w:r>
+      <w:r>
+        <w:t xml:space="preserve"> </w:t>
+      </w:r>
+      <w:r>
+        <w:rPr>
+          <w:bCs/>
+          <w:b/>
+        </w:rPr>
+        <w:t xml:space="preserve">even zone distribution</w:t>
+      </w:r>
+      <w:r>
+        <w:t xml:space="preserve"> </w:t>
+      </w:r>
+      <w:r>
+        <w:t xml:space="preserve">—</w:t>
+      </w:r>
+      <w:r>
+        <w:t xml:space="preserve"> </w:t>
+      </w:r>
+      <w:r>
+        <w:rPr>
+          <w:bCs/>
+          <w:b/>
+        </w:rPr>
+        <w:t xml:space="preserve">PLC-011</w:t>
+      </w:r>
+      <w:r>
+        <w:t xml:space="preserve"> </w:t>
+      </w:r>
+      <w:r>
+        <w:t xml:space="preserve">even ≈</w:t>
+      </w:r>
+      <w:r>
+        <w:rPr>
+          <w:rStyle w:val="VerbatimChar"/>
+        </w:rPr>
+        <w:t xml:space="preserve">1/zone_count</w:t>
+      </w:r>
+      <w:r>
+        <w:t xml:space="preserve"> </w:t>
+      </w:r>
+      <w:r>
+        <w:t xml:space="preserve">distribution + rebalancing (tolerance C-13, formula Appendix A.9). Enumerations added:</w:t>
+      </w:r>
+      <w:r>
+        <w:t xml:space="preserve"> </w:t>
+      </w:r>
+      <w:r>
+        <w:rPr>
+          <w:rStyle w:val="VerbatimChar"/>
+        </w:rPr>
+        <w:t xml:space="preserve">ReservationType</w:t>
+      </w:r>
+      <w:r>
+        <w:t xml:space="preserve">,</w:t>
+      </w:r>
+      <w:r>
+        <w:t xml:space="preserve"> </w:t>
+      </w:r>
+      <w:r>
+        <w:rPr>
+          <w:rStyle w:val="VerbatimChar"/>
+        </w:rPr>
+        <w:t xml:space="preserve">CRGScope</w:t>
+      </w:r>
+      <w:r>
+        <w:t xml:space="preserve">,</w:t>
+      </w:r>
+      <w:r>
+        <w:t xml:space="preserve"> </w:t>
+      </w:r>
+      <w:r>
+        <w:rPr>
+          <w:rStyle w:val="VerbatimChar"/>
+        </w:rPr>
+        <w:t xml:space="preserve">PlacementKind</w:t>
+      </w:r>
+      <w:r>
+        <w:t xml:space="preserve">,</w:t>
+      </w:r>
+      <w:r>
+        <w:t xml:space="preserve"> </w:t>
+      </w:r>
+      <w:r>
+        <w:rPr>
+          <w:rStyle w:val="VerbatimChar"/>
+        </w:rPr>
+        <w:t xml:space="preserve">GovernanceStatus</w:t>
+      </w:r>
+      <w:r>
+        <w:t xml:space="preserve">. The</w:t>
+      </w:r>
+      <w:r>
+        <w:t xml:space="preserve"> </w:t>
+      </w:r>
+      <w:r>
+        <w:rPr>
+          <w:bCs/>
+          <w:b/>
+        </w:rPr>
+        <w:t xml:space="preserve">region model is geography-aware</w:t>
+      </w:r>
+      <w:r>
+        <w:t xml:space="preserve"> </w:t>
+      </w:r>
+      <w:r>
+        <w:t xml:space="preserve">(US three-region Prod/CVAL/DR distinct; EU/Australia/Asia Pacific two-region with CVAL+DR co-located per PLC-010a; Middle East</w:t>
+      </w:r>
+      <w:r>
+        <w:t xml:space="preserve"> </w:t>
+      </w:r>
+      <w:r>
+        <w:rPr>
+          <w:rStyle w:val="VerbatimChar"/>
+        </w:rPr>
+        <w:t xml:space="preserve">DR_NOT_OFFERED</w:t>
+      </w:r>
+      <w:r>
+        <w:t xml:space="preserve"> </w:t>
+      </w:r>
+      <w:r>
+        <w:t xml:space="preserve">per DEC-001) — see ADR-001 v2.4. Authoritative schemas remain in the FDD and TDD.</w:t>
       </w:r>
     </w:p>
     <w:p>
@@ -753,7 +1280,148 @@
           <w:bCs/>
           <w:b/>
         </w:rPr>
-        <w:t xml:space="preserve">Three-CRG model per region</w:t>
+        <w:t xml:space="preserve">Per-environment CRG structure — regional + per-AZ (v2.4, CAP-023)</w:t>
+      </w:r>
+      <w:r>
+        <w:t xml:space="preserve"> </w:t>
+      </w:r>
+      <w:r>
+        <w:t xml:space="preserve">— each environment (Prod, NonProd, DR) carries one</w:t>
+      </w:r>
+      <w:r>
+        <w:t xml:space="preserve"> </w:t>
+      </w:r>
+      <w:r>
+        <w:rPr>
+          <w:bCs/>
+          <w:b/>
+        </w:rPr>
+        <w:t xml:space="preserve">regional</w:t>
+      </w:r>
+      <w:r>
+        <w:t xml:space="preserve"> </w:t>
+      </w:r>
+      <w:r>
+        <w:t xml:space="preserve">CRG (</w:t>
+      </w:r>
+      <w:r>
+        <w:rPr>
+          <w:rStyle w:val="VerbatimChar"/>
+        </w:rPr>
+        <w:t xml:space="preserve">crg-&lt;env&gt;-&lt;region&gt;-reg</w:t>
+      </w:r>
+      <w:r>
+        <w:t xml:space="preserve">) plus one CRG</w:t>
+      </w:r>
+      <w:r>
+        <w:t xml:space="preserve"> </w:t>
+      </w:r>
+      <w:r>
+        <w:rPr>
+          <w:bCs/>
+          <w:b/>
+        </w:rPr>
+        <w:t xml:space="preserve">per availability zone</w:t>
+      </w:r>
+      <w:r>
+        <w:t xml:space="preserve"> </w:t>
+      </w:r>
+      <w:r>
+        <w:t xml:space="preserve">(</w:t>
+      </w:r>
+      <w:r>
+        <w:rPr>
+          <w:rStyle w:val="VerbatimChar"/>
+        </w:rPr>
+        <w:t xml:space="preserve">az1/az2/az3</w:t>
+      </w:r>
+      <w:r>
+        <w:t xml:space="preserve">), extending the earlier three-CRG (Prod/NonProd/DR) model.</w:t>
+      </w:r>
+      <w:r>
+        <w:t xml:space="preserve"> </w:t>
+      </w:r>
+      <w:r>
+        <w:rPr>
+          <w:rStyle w:val="VerbatimChar"/>
+        </w:rPr>
+        <w:t xml:space="preserve">CapacityReservationGroup</w:t>
+      </w:r>
+      <w:r>
+        <w:t xml:space="preserve"> </w:t>
+      </w:r>
+      <w:r>
+        <w:t xml:space="preserve">carries</w:t>
+      </w:r>
+      <w:r>
+        <w:t xml:space="preserve"> </w:t>
+      </w:r>
+      <w:r>
+        <w:rPr>
+          <w:rStyle w:val="VerbatimChar"/>
+        </w:rPr>
+        <w:t xml:space="preserve">environment</w:t>
+      </w:r>
+      <w:r>
+        <w:t xml:space="preserve"> </w:t>
+      </w:r>
+      <w:r>
+        <w:t xml:space="preserve">and</w:t>
+      </w:r>
+      <w:r>
+        <w:t xml:space="preserve"> </w:t>
+      </w:r>
+      <w:r>
+        <w:rPr>
+          <w:rStyle w:val="VerbatimChar"/>
+        </w:rPr>
+        <w:t xml:space="preserve">crgScope</w:t>
+      </w:r>
+      <w:r>
+        <w:t xml:space="preserve"> </w:t>
+      </w:r>
+      <w:r>
+        <w:t xml:space="preserve">(</w:t>
+      </w:r>
+      <w:r>
+        <w:rPr>
+          <w:rStyle w:val="VerbatimChar"/>
+        </w:rPr>
+        <w:t xml:space="preserve">REGIONAL | ZONAL</w:t>
+      </w:r>
+      <w:r>
+        <w:t xml:space="preserve">).</w:t>
+      </w:r>
+      <w:r>
+        <w:t xml:space="preserve"> </w:t>
+      </w:r>
+      <w:r>
+        <w:rPr>
+          <w:rStyle w:val="VerbatimChar"/>
+        </w:rPr>
+        <w:t xml:space="preserve">CustomerRegionAssignment</w:t>
+      </w:r>
+      <w:r>
+        <w:t xml:space="preserve"> </w:t>
+      </w:r>
+      <w:r>
+        <w:t xml:space="preserve">continues to target the three environments; each environment now resolves to its regional + zonal CRG set. Naming is deterministic per OPS-006/C-12.</w:t>
+      </w:r>
+      <w:r>
+        <w:br/>
+      </w:r>
+      <w:r>
+        <w:t xml:space="preserve">✅</w:t>
+      </w:r>
+      <w:r>
+        <w:t xml:space="preserve"> </w:t>
+      </w:r>
+      <w:r>
+        <w:rPr>
+          <w:bCs/>
+          <w:b/>
+        </w:rPr>
+        <w:t xml:space="preserve">Single governed quota pool per region/quota family (v2.2, QUA-004)</w:t>
       </w:r>
       <w:r>
         <w:t xml:space="preserve"> </w:t>
@@ -768,13 +1436,106 @@
         <w:rPr>
           <w:rStyle w:val="VerbatimChar"/>
         </w:rPr>
-        <w:t xml:space="preserve">CustomerRegionAssignment</w:t>
-      </w:r>
-      <w:r>
-        <w:t xml:space="preserve"> </w:t>
-      </w:r>
-      <w:r>
-        <w:t xml:space="preserve">targets exactly 3 CRGs: Prod, NonProd, DR</w:t>
+        <w:t xml:space="preserve">QuotaPoolState</w:t>
+      </w:r>
+      <w:r>
+        <w:t xml:space="preserve"> </w:t>
+      </w:r>
+      <w:r>
+        <w:t xml:space="preserve">covers Prod + NonProd/CVAL + DR together; Prod and DR protected by</w:t>
+      </w:r>
+      <w:r>
+        <w:t xml:space="preserve"> </w:t>
+      </w:r>
+      <w:r>
+        <w:rPr>
+          <w:bCs/>
+          <w:b/>
+        </w:rPr>
+        <w:t xml:space="preserve">logical earmarks</w:t>
+      </w:r>
+      <w:r>
+        <w:t xml:space="preserve"> </w:t>
+      </w:r>
+      <w:r>
+        <w:t xml:space="preserve">(</w:t>
+      </w:r>
+      <w:r>
+        <w:rPr>
+          <w:rStyle w:val="VerbatimChar"/>
+        </w:rPr>
+        <w:t xml:space="preserve">prod_reserved_floor</w:t>
+      </w:r>
+      <w:r>
+        <w:t xml:space="preserve">,</w:t>
+      </w:r>
+      <w:r>
+        <w:t xml:space="preserve"> </w:t>
+      </w:r>
+      <w:r>
+        <w:rPr>
+          <w:rStyle w:val="VerbatimChar"/>
+        </w:rPr>
+        <w:t xml:space="preserve">dr_earmark_vcpu</w:t>
+      </w:r>
+      <w:r>
+        <w:t xml:space="preserve">), not physical group separation. The earlier</w:t>
+      </w:r>
+      <w:r>
+        <w:t xml:space="preserve"> </w:t>
+      </w:r>
+      <w:r>
+        <w:rPr>
+          <w:rStyle w:val="VerbatimChar"/>
+        </w:rPr>
+        <w:t xml:space="preserve">QuotaGroupType.PROD</w:t>
+      </w:r>
+      <w:r>
+        <w:t xml:space="preserve"> </w:t>
+      </w:r>
+      <w:r>
+        <w:t xml:space="preserve">+</w:t>
+      </w:r>
+      <w:r>
+        <w:t xml:space="preserve"> </w:t>
+      </w:r>
+      <w:r>
+        <w:rPr>
+          <w:rStyle w:val="VerbatimChar"/>
+        </w:rPr>
+        <w:t xml:space="preserve">QuotaGroupType.NONPROD_DR_SHARED</w:t>
+      </w:r>
+      <w:r>
+        <w:t xml:space="preserve"> </w:t>
+      </w:r>
+      <w:r>
+        <w:rPr>
+          <w:bCs/>
+          <w:b/>
+        </w:rPr>
+        <w:t xml:space="preserve">two-group</w:t>
+      </w:r>
+      <w:r>
+        <w:t xml:space="preserve"> </w:t>
+      </w:r>
+      <w:r>
+        <w:t xml:space="preserve">model is retained only as a narrow Azure-limit / Prod-isolation</w:t>
+      </w:r>
+      <w:r>
+        <w:t xml:space="preserve"> </w:t>
+      </w:r>
+      <w:r>
+        <w:rPr>
+          <w:bCs/>
+          <w:b/>
+        </w:rPr>
+        <w:t xml:space="preserve">exception topology</w:t>
+      </w:r>
+      <w:r>
+        <w:t xml:space="preserve"> </w:t>
+      </w:r>
+      <w:r>
+        <w:t xml:space="preserve">(ADR-002 v2.2).</w:t>
       </w:r>
       <w:r>
         <w:br/>
@@ -790,7 +1551,7 @@
           <w:bCs/>
           <w:b/>
         </w:rPr>
-        <w:t xml:space="preserve">Single governed quota pool per region/quota family (v2.2, QUA-004)</w:t>
+        <w:t xml:space="preserve">v2.2 domain entities added</w:t>
       </w:r>
       <w:r>
         <w:t xml:space="preserve"> </w:t>
@@ -805,23 +1566,119 @@
         <w:rPr>
           <w:rStyle w:val="VerbatimChar"/>
         </w:rPr>
-        <w:t xml:space="preserve">QuotaPoolState</w:t>
-      </w:r>
-      <w:r>
-        <w:t xml:space="preserve"> </w:t>
-      </w:r>
-      <w:r>
-        <w:t xml:space="preserve">covers Prod + NonProd/CVAL + DR together; Prod and DR protected by</w:t>
-      </w:r>
-      <w:r>
-        <w:t xml:space="preserve"> </w:t>
-      </w:r>
-      <w:r>
-        <w:rPr>
-          <w:bCs/>
-          <w:b/>
-        </w:rPr>
-        <w:t xml:space="preserve">logical earmarks</w:t>
+        <w:t xml:space="preserve">CustomerSeedRecord</w:t>
+      </w:r>
+      <w:r>
+        <w:t xml:space="preserve"> </w:t>
+      </w:r>
+      <w:r>
+        <w:t xml:space="preserve">(PLC-003, first-placement authority),</w:t>
+      </w:r>
+      <w:r>
+        <w:t xml:space="preserve"> </w:t>
+      </w:r>
+      <w:r>
+        <w:rPr>
+          <w:rStyle w:val="VerbatimChar"/>
+        </w:rPr>
+        <w:t xml:space="preserve">SourceDestinationDRIndex</w:t>
+      </w:r>
+      <w:r>
+        <w:t xml:space="preserve"> </w:t>
+      </w:r>
+      <w:r>
+        <w:t xml:space="preserve">(DR-018, reverse-of-seed driving max-not-sum sizing and standby activation),</w:t>
+      </w:r>
+      <w:r>
+        <w:t xml:space="preserve"> </w:t>
+      </w:r>
+      <w:r>
+        <w:rPr>
+          <w:rStyle w:val="VerbatimChar"/>
+        </w:rPr>
+        <w:t xml:space="preserve">CVALEarmarkRecord</w:t>
+      </w:r>
+      <w:r>
+        <w:t xml:space="preserve"> </w:t>
+      </w:r>
+      <w:r>
+        <w:t xml:space="preserve">(PLC-010, prevents CVAL/DR double-count). See the FDD Section 6 and TDD Section 6/Section 18 (diagram T5, T14) for full schemas.</w:t>
+      </w:r>
+      <w:r>
+        <w:br/>
+      </w:r>
+      <w:r>
+        <w:t xml:space="preserve">✅</w:t>
+      </w:r>
+      <w:r>
+        <w:t xml:space="preserve"> </w:t>
+      </w:r>
+      <w:r>
+        <w:rPr>
+          <w:bCs/>
+          <w:b/>
+        </w:rPr>
+        <w:t xml:space="preserve">v2.4 domain entities added</w:t>
+      </w:r>
+      <w:r>
+        <w:t xml:space="preserve"> </w:t>
+      </w:r>
+      <w:r>
+        <w:t xml:space="preserve">—</w:t>
+      </w:r>
+      <w:r>
+        <w:t xml:space="preserve"> </w:t>
+      </w:r>
+      <w:r>
+        <w:rPr>
+          <w:rStyle w:val="VerbatimChar"/>
+        </w:rPr>
+        <w:t xml:space="preserve">SeedMatrixEntry</w:t>
+      </w:r>
+      <w:r>
+        <w:t xml:space="preserve"> </w:t>
+      </w:r>
+      <w:r>
+        <w:t xml:space="preserve">(CAP-022, product-team-governed seed matrix initialised at 0, extends CAP-009) and</w:t>
+      </w:r>
+      <w:r>
+        <w:t xml:space="preserve"> </w:t>
+      </w:r>
+      <w:r>
+        <w:rPr>
+          <w:rStyle w:val="VerbatimChar"/>
+        </w:rPr>
+        <w:t xml:space="preserve">ReservationEligibility</w:t>
+      </w:r>
+      <w:r>
+        <w:t xml:space="preserve"> </w:t>
+      </w:r>
+      <w:r>
+        <w:t xml:space="preserve">(CAP-020/CAP-021, Availability-Set-VM ineligibility + deallocate/redeploy-to-AZ onboarding precondition).</w:t>
+      </w:r>
+      <w:r>
+        <w:t xml:space="preserve"> </w:t>
+      </w:r>
+      <w:r>
+        <w:rPr>
+          <w:rStyle w:val="VerbatimChar"/>
+        </w:rPr>
+        <w:t xml:space="preserve">CapacityReservation</w:t>
+      </w:r>
+      <w:r>
+        <w:t xml:space="preserve"> </w:t>
+      </w:r>
+      <w:r>
+        <w:t xml:space="preserve">gains</w:t>
+      </w:r>
+      <w:r>
+        <w:t xml:space="preserve"> </w:t>
+      </w:r>
+      <w:r>
+        <w:rPr>
+          <w:rStyle w:val="VerbatimChar"/>
+        </w:rPr>
+        <w:t xml:space="preserve">reservationType</w:t>
       </w:r>
       <w:r>
         <w:t xml:space="preserve"> </w:t>
@@ -833,7 +1690,7 @@
         <w:rPr>
           <w:rStyle w:val="VerbatimChar"/>
         </w:rPr>
-        <w:t xml:space="preserve">prod_reserved_floor</w:t>
+        <w:t xml:space="preserve">SEED | ACTIVE</w:t>
       </w:r>
       <w:r>
         <w:t xml:space="preserve">,</w:t>
@@ -845,133 +1702,49 @@
         <w:rPr>
           <w:rStyle w:val="VerbatimChar"/>
         </w:rPr>
-        <w:t xml:space="preserve">dr_earmark_vcpu</w:t>
-      </w:r>
-      <w:r>
-        <w:t xml:space="preserve">), not physical group separation. The earlier</w:t>
-      </w:r>
-      <w:r>
-        <w:t xml:space="preserve"> </w:t>
-      </w:r>
-      <w:r>
-        <w:rPr>
-          <w:rStyle w:val="VerbatimChar"/>
-        </w:rPr>
-        <w:t xml:space="preserve">QuotaGroupType.PROD</w:t>
-      </w:r>
-      <w:r>
-        <w:t xml:space="preserve"> </w:t>
-      </w:r>
-      <w:r>
-        <w:t xml:space="preserve">+</w:t>
-      </w:r>
-      <w:r>
-        <w:t xml:space="preserve"> </w:t>
-      </w:r>
-      <w:r>
-        <w:rPr>
-          <w:rStyle w:val="VerbatimChar"/>
-        </w:rPr>
-        <w:t xml:space="preserve">QuotaGroupType.NONPROD_DR_SHARED</w:t>
-      </w:r>
-      <w:r>
-        <w:t xml:space="preserve"> </w:t>
-      </w:r>
-      <w:r>
-        <w:rPr>
-          <w:bCs/>
-          <w:b/>
-        </w:rPr>
-        <w:t xml:space="preserve">two-group</w:t>
-      </w:r>
-      <w:r>
-        <w:t xml:space="preserve"> </w:t>
-      </w:r>
-      <w:r>
-        <w:t xml:space="preserve">model is retained only as a narrow Azure-limit / Prod-isolation</w:t>
-      </w:r>
-      <w:r>
-        <w:t xml:space="preserve"> </w:t>
-      </w:r>
-      <w:r>
-        <w:rPr>
-          <w:bCs/>
-          <w:b/>
-        </w:rPr>
-        <w:t xml:space="preserve">exception topology</w:t>
-      </w:r>
-      <w:r>
-        <w:t xml:space="preserve"> </w:t>
-      </w:r>
-      <w:r>
-        <w:t xml:space="preserve">(ADR-002 v2.2).</w:t>
-      </w:r>
-      <w:r>
-        <w:br/>
-      </w:r>
-      <w:r>
-        <w:t xml:space="preserve">✅</w:t>
-      </w:r>
-      <w:r>
-        <w:t xml:space="preserve"> </w:t>
-      </w:r>
-      <w:r>
-        <w:rPr>
-          <w:bCs/>
-          <w:b/>
-        </w:rPr>
-        <w:t xml:space="preserve">v2.2 domain entities added</w:t>
-      </w:r>
-      <w:r>
-        <w:t xml:space="preserve"> </w:t>
-      </w:r>
-      <w:r>
-        <w:t xml:space="preserve">—</w:t>
-      </w:r>
-      <w:r>
-        <w:t xml:space="preserve"> </w:t>
-      </w:r>
-      <w:r>
-        <w:rPr>
-          <w:rStyle w:val="VerbatimChar"/>
-        </w:rPr>
-        <w:t xml:space="preserve">CustomerSeedRecord</w:t>
-      </w:r>
-      <w:r>
-        <w:t xml:space="preserve"> </w:t>
-      </w:r>
-      <w:r>
-        <w:t xml:space="preserve">(PLC-003, first-placement authority),</w:t>
-      </w:r>
-      <w:r>
-        <w:t xml:space="preserve"> </w:t>
-      </w:r>
-      <w:r>
-        <w:rPr>
-          <w:rStyle w:val="VerbatimChar"/>
-        </w:rPr>
-        <w:t xml:space="preserve">SourceDestinationDRIndex</w:t>
-      </w:r>
-      <w:r>
-        <w:t xml:space="preserve"> </w:t>
-      </w:r>
-      <w:r>
-        <w:t xml:space="preserve">(DR-018, reverse-of-seed driving max-not-sum sizing and standby activation),</w:t>
-      </w:r>
-      <w:r>
-        <w:t xml:space="preserve"> </w:t>
-      </w:r>
-      <w:r>
-        <w:rPr>
-          <w:rStyle w:val="VerbatimChar"/>
-        </w:rPr>
-        <w:t xml:space="preserve">CVALEarmarkRecord</w:t>
-      </w:r>
-      <w:r>
-        <w:t xml:space="preserve"> </w:t>
-      </w:r>
-      <w:r>
-        <w:t xml:space="preserve">(PLC-010, prevents CVAL/DR double-count). See the FDD Section 6 and TDD Section 6/Section 18 (diagram T5, T14) for full schemas.</w:t>
+        <w:t xml:space="preserve">isSeed()</w:t>
+      </w:r>
+      <w:r>
+        <w:t xml:space="preserve">) and</w:t>
+      </w:r>
+      <w:r>
+        <w:t xml:space="preserve"> </w:t>
+      </w:r>
+      <w:r>
+        <w:rPr>
+          <w:rStyle w:val="VerbatimChar"/>
+        </w:rPr>
+        <w:t xml:space="preserve">placementType</w:t>
+      </w:r>
+      <w:r>
+        <w:t xml:space="preserve">; reactive SKU/AZ discovery (CAP-024) auto-creates missing reservations against the seed matrix and raises a scope-file governance item. Even ≈</w:t>
+      </w:r>
+      <w:r>
+        <w:rPr>
+          <w:rStyle w:val="VerbatimChar"/>
+        </w:rPr>
+        <w:t xml:space="preserve">1/zone_count</w:t>
+      </w:r>
+      <w:r>
+        <w:t xml:space="preserve"> </w:t>
+      </w:r>
+      <w:r>
+        <w:t xml:space="preserve">zone distribution + rebalancing (PLC-011, tolerance C-13, formula Appendix A.9). See</w:t>
+      </w:r>
+      <w:r>
+        <w:t xml:space="preserve"> </w:t>
+      </w:r>
+      <w:r>
+        <w:rPr>
+          <w:rStyle w:val="VerbatimChar"/>
+        </w:rPr>
+        <w:t xml:space="preserve">uml_01_core_domain_model.md</w:t>
+      </w:r>
+      <w:r>
+        <w:t xml:space="preserve"> </w:t>
+      </w:r>
+      <w:r>
+        <w:t xml:space="preserve">and TDD Section 6 for full schemas.</w:t>
       </w:r>
       <w:r>
         <w:br/>

</xml_diff>